<commit_message>
Remove unused Turnitin note from report
</commit_message>
<xml_diff>
--- a/project/Pill_dispenser/Pill_Dispenser_Report_Metropolia_Template.docx
+++ b/project/Pill_dispenser/Pill_Dispenser_Report_Metropolia_Template.docx
@@ -205,11 +205,6 @@
     <w:p>
       <w:r>
         <w:t>___________________________________________________________</w:t>
-      </w:r>
-    </w:p>
-    <w:p>
-      <w:r>
-        <w:t>The originality of this report has not been checked with Turnitin Originality Check service.</w:t>
       </w:r>
     </w:p>
     <w:p>

</xml_diff>

<commit_message>
Add practical test observations to report
</commit_message>
<xml_diff>
--- a/project/Pill_dispenser/Pill_Dispenser_Report_Metropolia_Template.docx
+++ b/project/Pill_dispenser/Pill_Dispenser_Report_Metropolia_Template.docx
@@ -116,7 +116,7 @@
       <w:r>
         <w:t>Number of Pages:</w:t>
         <w:tab/>
-        <w:t>10 pages + 0 appendices</w:t>
+        <w:t>13 pages + 0 appendices</w:t>
       </w:r>
     </w:p>
     <w:p>
@@ -222,7 +222,14 @@
         <w:t>Contents</w:t>
       </w:r>
     </w:p>
-    <w:p>
+    <w:p/>
+    <w:p>
+      <w:r>
+        <w:br w:type="page"/>
+      </w:r>
+    </w:p>
+    <w:p>
+      <w:pPr/>
       <w:r>
         <w:t>1 Introduction</w:t>
         <w:tab/>
@@ -231,29 +238,33 @@
       </w:r>
     </w:p>
     <w:p>
+      <w:pPr/>
       <w:r>
         <w:t>2 Hardware Connections</w:t>
         <w:tab/>
-        <w:t>4</w:t>
-      </w:r>
-    </w:p>
-    <w:p>
+        <w:t>5</w:t>
+      </w:r>
+    </w:p>
+    <w:p>
+      <w:pPr/>
       <w:r>
         <w:t>3 Program Structure</w:t>
         <w:tab/>
         <w:tab/>
-        <w:t>4</w:t>
-      </w:r>
-    </w:p>
-    <w:p>
+        <w:t>5</w:t>
+      </w:r>
+    </w:p>
+    <w:p>
+      <w:pPr/>
       <w:r>
         <w:t>4 Code Examples</w:t>
         <w:tab/>
         <w:tab/>
-        <w:t>5</w:t>
-      </w:r>
-    </w:p>
-    <w:p>
+        <w:t>6</w:t>
+      </w:r>
+    </w:p>
+    <w:p>
+      <w:pPr/>
       <w:r>
         <w:t>5 State Machine</w:t>
         <w:tab/>
@@ -262,6 +273,7 @@
       </w:r>
     </w:p>
     <w:p>
+      <w:pPr/>
       <w:r>
         <w:t>6 Calibration</w:t>
         <w:tab/>
@@ -270,6 +282,7 @@
       </w:r>
     </w:p>
     <w:p>
+      <w:pPr/>
       <w:r>
         <w:t>7 Dispensing and Piezo Detection</w:t>
         <w:tab/>
@@ -277,14 +290,16 @@
       </w:r>
     </w:p>
     <w:p>
+      <w:pPr/>
       <w:r>
         <w:t>8 EEPROM Recovery</w:t>
         <w:tab/>
         <w:tab/>
-        <w:t>8</w:t>
-      </w:r>
-    </w:p>
-    <w:p>
+        <w:t>9</w:t>
+      </w:r>
+    </w:p>
+    <w:p>
+      <w:pPr/>
       <w:r>
         <w:t>9 LoRaWAN Communication</w:t>
         <w:tab/>
@@ -292,31 +307,37 @@
       </w:r>
     </w:p>
     <w:p>
+      <w:pPr/>
       <w:r>
         <w:t>10 Building, Running and Testing</w:t>
         <w:tab/>
-        <w:t>9</w:t>
-      </w:r>
-    </w:p>
-    <w:p>
-      <w:r>
-        <w:t>11 Conclusion</w:t>
+        <w:t>10</w:t>
+      </w:r>
+    </w:p>
+    <w:p>
+      <w:pPr/>
+      <w:r>
+        <w:t>11 Practical Test Results</w:t>
+        <w:tab/>
+        <w:t>11</w:t>
+      </w:r>
+    </w:p>
+    <w:p>
+      <w:pPr/>
+      <w:r>
+        <w:t>12 Conclusion</w:t>
         <w:tab/>
         <w:tab/>
-        <w:t>10</w:t>
-      </w:r>
-    </w:p>
-    <w:p>
-      <w:r>
-        <w:t>12 References</w:t>
+        <w:t>12</w:t>
+      </w:r>
+    </w:p>
+    <w:p>
+      <w:pPr/>
+      <w:r>
+        <w:t>13 References</w:t>
         <w:tab/>
         <w:tab/>
-        <w:t>10</w:t>
-      </w:r>
-    </w:p>
-    <w:p>
-      <w:r>
-        <w:br w:type="page"/>
+        <w:t>13</w:t>
       </w:r>
     </w:p>
     <w:p>
@@ -1645,6 +1666,62 @@
       </w:pPr>
       <w:r>
         <w:t>Test LoRaWAN status reception in the school network with the provided receiver script.</w:t>
+      </w:r>
+    </w:p>
+    <w:p>
+      <w:pPr>
+        <w:pStyle w:val="Otsikko1"/>
+      </w:pPr>
+      <w:r>
+        <w:t>Practical Test Results</w:t>
+      </w:r>
+    </w:p>
+    <w:p>
+      <w:pPr>
+        <w:pStyle w:val="Leipteksti"/>
+      </w:pPr>
+      <w:r>
+        <w:t>Functional testing was carried out with the assembled course board and LoRaWAN coverage available at school. The LoRaWAN part could not be repeated later at home, because joining the network depends on the campus gateway and course network coverage. Therefore, the report separates the classroom observations from the home limitation instead of treating a missing home join as a software failure.</w:t>
+      </w:r>
+    </w:p>
+    <w:p>
+      <w:pPr>
+        <w:pStyle w:val="Leipteksti"/>
+      </w:pPr>
+      <w:r>
+        <w:t>The serial monitor confirmed the LoRa-E5 setup sequence. The module answered the basic AT check with LoRa: +AT: OK, accepted OTAA configuration, joined the network and returned join status lines including +JOIN: Network joined and +JOIN: Done. After joining, the program sent short AT+MSG status messages for boot, calibration, schedule start and dispensing events. This verified that the code produces LoRa output through the LoRa-E5 module, while still allowing the dispenser to continue if the network is temporarily unavailable.</w:t>
+      </w:r>
+    </w:p>
+    <w:p>
+      <w:pPr>
+        <w:pStyle w:val="Leipteksti"/>
+      </w:pPr>
+      <w:r>
+        <w:t>Calibration was tested with SW0. The wheel first searched for the opto fork reference opening, then measured one full revolution. In the working test, the measured value was approximately 4097 half steps per revolution, which gives 512 half steps per compartment for the eight-position dispenser wheel. The final version does not stop at the first opto edge; it moves to the middle of the measured opening so that the dispensing hole is aligned more accurately.</w:t>
+      </w:r>
+    </w:p>
+    <w:p>
+      <w:pPr>
+        <w:pStyle w:val="Leipteksti"/>
+      </w:pPr>
+      <w:r>
+        <w:t>The dispensing schedule was tested after calibration by pressing SW0 again. The monitor showed the schedule start message and then one compartment movement every 30 seconds. During the test without a reliable pill drop on every movement, the no-pill path was also seen with output such as No pill detected, pills left: 6. The program reduced the remaining position count after the mechanical movement, reported the event through LoRa, and used the LED warning behavior for the missing piezo detection. This was useful because it verified both the normal motor path and the sensor-failure path.</w:t>
+      </w:r>
+    </w:p>
+    <w:p>
+      <w:pPr>
+        <w:pStyle w:val="Leipteksti"/>
+      </w:pPr>
+      <w:r>
+        <w:t>EEPROM recovery was checked by restarting the device and confirming that the program restored the saved mode and pill count instead of always starting from an empty default state. The code saves turn_in_progress before the motor starts and clears it only after the turn is complete. If power is lost during a movement, the next boot uses this flag to reverse back to the opto reference, return to the last completed position and finish the interrupted dispense immediately. This avoids writing every motor step to EEPROM while still preserving the started dose.</w:t>
+      </w:r>
+    </w:p>
+    <w:p>
+      <w:pPr>
+        <w:pStyle w:val="Leipteksti"/>
+      </w:pPr>
+      <w:r>
+        <w:t>The main practical observation from testing was mechanical alignment. A small visible offset can occur if the wheel, opto fork and dispenser hole are not physically mounted in exactly the same reference position. The software compensates for this by measuring the opto opening width and moving to its midpoint, but final accuracy still depends on the physical assembly.</w:t>
       </w:r>
     </w:p>
     <w:p>

</xml_diff>

<commit_message>
Make report wording more personal
</commit_message>
<xml_diff>
--- a/project/Pill_dispenser/Pill_Dispenser_Report_Metropolia_Template.docx
+++ b/project/Pill_dispenser/Pill_Dispenser_Report_Metropolia_Template.docx
@@ -179,7 +179,7 @@
         <w:pStyle w:val="BodyTextNoSpacing"/>
       </w:pPr>
       <w:r>
-        <w:t>This report describes the design and implementation of a Raspberry Pi Pico based pill dispenser. The system calibrates a stepper-driven dispenser wheel with an opto fork sensor, waits for the user to start the schedule, and then dispenses one pill position every 30 seconds. A piezo sensor is handled with a GPIO interrupt to detect whether a pill has dropped. The project stores operating state in an AT24C256 EEPROM so that a power loss during motor movement can be detected, recovered by reversing to the calibration opening, and completed after reboot. The device also sends status messages through a LoRa-E5 module using AT commands.</w:t>
+        <w:t>This report describes the pill dispenser that I built with a Raspberry Pi Pico for the Embedded Systems Programming course. The device uses a stepper motor to move an eight-position dispenser wheel, an opto fork to find the reference position, a piezo sensor to detect a dropped pill, an AT24C256 EEPROM for saved state and a LoRa-E5 module for status messages. After calibration, the dispenser starts from SW0 and moves one pill position at a time with a 30 second interval.</w:t>
       </w:r>
     </w:p>
     <w:p>
@@ -187,7 +187,7 @@
         <w:pStyle w:val="BodyTextNoSpacing"/>
       </w:pPr>
       <w:r>
-        <w:t>The implementation focuses on clear embedded C structure. Interrupt service routines only record events, while application decisions are made in the main loop. The calibration routine measures both edges of the opto opening and centers the dispenser position before the schedule starts. The result is a readable course project implementation that combines motor control, sensors, non-volatile memory and LoRa communication.</w:t>
+        <w:t>The most important software part was recovery after a reset during motor movement. Before a dispense movement starts, the program saves that a turn is in progress. If power is lost at that moment, the next boot reverses the wheel back to the opto reference, restores the last known position and finishes the interrupted dispense. I kept interrupt handlers short and put the actual decisions in the main loop.</w:t>
       </w:r>
     </w:p>
     <w:p>
@@ -354,7 +354,7 @@
         <w:pStyle w:val="Leipteksti"/>
       </w:pPr>
       <w:r>
-        <w:t>The aim of the project is to build an embedded pill dispenser controller with the Raspberry Pi Pico and the second-year embedded systems board. The required behaviour and mechanical arrangement are based on the course project handout (Metropolia UAS, 2026a). The program controls a stepper motor driven wheel, detects a reference position with an opto fork sensor, detects dropped pills with a piezo sensor, stores recovery data to EEPROM and reports important events with a LoRa-E5 module.</w:t>
+        <w:t>The aim of this project was to make a working embedded pill dispenser controller with the Raspberry Pi Pico and the second-year embedded systems board. I followed the course project handout for the required behaviour and the mechanical idea of the dispenser (Metropolia UAS, 2026a). The program controls the stepper-driven wheel, finds a reference position with the opto fork, checks pill drops with the piezo sensor, stores recovery data in EEPROM and sends important events through the LoRa-E5 module.</w:t>
       </w:r>
     </w:p>
     <w:p>
@@ -362,7 +362,7 @@
         <w:pStyle w:val="Leipteksti"/>
       </w:pPr>
       <w:r>
-        <w:t>The project is implemented in C with the Raspberry Pi Pico SDK and its hardware libraries (Raspberry Pi Ltd., n.d.). The main source file is project/Pill_dispenser/main.c and the build target is pill_dispenser. The run configuration flashes the Pico through OpenOCD and the debug probe, and the monitor configuration shows the debug output through the serial connection.</w:t>
+        <w:t>The project is implemented in C with the Raspberry Pi Pico SDK and its hardware libraries (Raspberry Pi Ltd., n.d.). The main source file is project/Pill_dispenser/main.c and the build target is pill_dispenser. In CLion, the run configuration flashes the Pico through OpenOCD and the debug probe. The monitor configuration is used for reading the debug output.</w:t>
       </w:r>
     </w:p>
     <w:p>
@@ -379,7 +379,7 @@
         <w:pStyle w:val="Leipteksti"/>
       </w:pPr>
       <w:r>
-        <w:t>The implementation uses the GPIO pins specified for the course board and project hardware (Metropolia UAS, 2026a; Metropolia UAS, 2026b). UART0 is kept for debug output and the LoRa module is connected to UART1.</w:t>
+        <w:t>The hardware connections use the GPIO pins from the course board and project material (Metropolia UAS, 2026a; Metropolia UAS, 2026b). I kept UART0 for debug output and connected the LoRa module to UART1.</w:t>
       </w:r>
     </w:p>
     <w:tbl>
@@ -870,7 +870,7 @@
         <w:pStyle w:val="Leipteksti"/>
       </w:pPr>
       <w:r>
-        <w:t>The code is divided into small functions by hardware responsibility and application logic. This keeps the main loop readable while still making the low-level behaviour easy to inspect.</w:t>
+        <w:t>I divided the code into functions by hardware part and by application task. This makes the main loop easier to follow, because most low-level details are handled in their own functions.</w:t>
       </w:r>
     </w:p>
     <w:p>
@@ -950,7 +950,7 @@
         <w:pStyle w:val="Leipteksti"/>
       </w:pPr>
       <w:r>
-        <w:t>The only changing global runtime variable is piezo_edges. It is global because it is shared between the piezo interrupt handler and the main loop. The ISR only increments this counter, so the interrupt logic stays short and predictable.</w:t>
+        <w:t>The only changing global runtime variable is piezo_edges. It has to be shared between the piezo interrupt handler and the main loop. The interrupt handler only increments this counter, so it stays short.</w:t>
       </w:r>
     </w:p>
     <w:p/>
@@ -968,7 +968,7 @@
         <w:keepNext/>
       </w:pPr>
       <w:r>
-        <w:t>The following excerpts show the most important implementation choices. The full source code remains in project/Pill_dispenser/main.c, but these short examples show how interrupts, persistent recovery and LoRa reporting are handled.</w:t>
+        <w:t>The following short code examples show the parts that are most important for the project: the piezo interrupt, saved motor-turn state, recovery after reset and LoRa reporting. The full code is in project/Pill_dispenser/main.c.</w:t>
       </w:r>
     </w:p>
     <w:p>
@@ -1005,7 +1005,7 @@
     </w:p>
     <w:p>
       <w:r>
-        <w:t>The interrupt service routine only records that the piezo input saw a falling edge. It does not print text, access EEPROM, move the motor or decide application state. This keeps the interrupt short and leaves the actual pill-detection decision to normal program flow.</w:t>
+        <w:t>The interrupt handler only records that the piezo input had a falling edge. It does not print text, use EEPROM or move the motor. The main loop later checks the counter and decides whether a pill was detected.</w:t>
       </w:r>
     </w:p>
     <w:p>
@@ -1051,7 +1051,7 @@
     </w:p>
     <w:p>
       <w:r>
-        <w:t>The EEPROM state is saved before the wheel starts moving. If power is lost during this movement, the next boot sees turn_in_progress and knows that the dispense had already started. The flag is cleared only after the compartment movement has finished.</w:t>
+        <w:t>The EEPROM state is saved before the wheel starts moving. If power is lost during the movement, the next boot can see turn_in_progress and knows that the dispense had already started. The flag is cleared only after the compartment movement is finished.</w:t>
       </w:r>
     </w:p>
     <w:p>
@@ -1098,7 +1098,7 @@
     </w:p>
     <w:p>
       <w:r>
-        <w:t>The recovery logic does not store every individual motor step. After a reset during movement, the wheel first moves backwards to the known opto reference opening. It then moves forward through already completed positions and completes the interrupted dispense before the normal schedule continues.</w:t>
+        <w:t>The recovery logic does not save every single motor step. After a reset during movement, the wheel first moves backwards to the known opto reference opening. Then it moves forward through the already completed positions and completes the interrupted dispense before continuing the normal schedule.</w:t>
       </w:r>
     </w:p>
     <w:p>
@@ -1131,7 +1131,7 @@
     </w:p>
     <w:p>
       <w:r>
-        <w:t>LoRa output is created as a short status string containing the event name and the remaining pill count. The string is sent to the LoRa-E5 module with the AT+MSG command. The AppKey is used for setup but is not printed to the debug console.</w:t>
+        <w:t>The LoRa message is a short status string with the event name and the remaining pill count. The string is sent to the LoRa-E5 module with AT+MSG. The AppKey is used when the module is configured, but it is not printed to the debug console.</w:t>
       </w:r>
     </w:p>
     <w:p>
@@ -1149,7 +1149,7 @@
         <w:pStyle w:val="Leipteksti"/>
       </w:pPr>
       <w:r>
-        <w:t>The dispenser behaviour is controlled with three saved operating modes.</w:t>
+        <w:t>The dispenser uses three saved operating modes.</w:t>
       </w:r>
     </w:p>
     <w:tbl>
@@ -1335,7 +1335,7 @@
         <w:pStyle w:val="Leipteksti"/>
       </w:pPr>
       <w:r>
-        <w:t>The normal operating sequence is intentionally simple:</w:t>
+        <w:t>The operating sequence I used is:</w:t>
       </w:r>
     </w:p>
     <w:p>
@@ -1423,7 +1423,7 @@
         <w:pStyle w:val="Leipteksti"/>
       </w:pPr>
       <w:r>
-        <w:t>The opto fork sensor is active low. When the calibration opening reaches the sensor, the input changes from high to low. The program first detects this falling edge and then continues until the signal rises again. This gives the measured width of the opto opening.</w:t>
+        <w:t>The opto fork sensor is active low. When the calibration opening reaches the sensor, the input changes from high to low. The program first detects this falling edge and then continues until the signal rises again. With these two edges, the program can measure the width of the opto opening.</w:t>
       </w:r>
     </w:p>
     <w:p>
@@ -1443,7 +1443,7 @@
         <w:pStyle w:val="Leipteksti"/>
       </w:pPr>
       <w:r>
-        <w:t>After the revolution measurement, the motor moves half of the opto opening width forward. This centers the dispenser opening on the opto sensor instead of stopping at the first edge of the opening. Impossible measurements are rejected so that a disconnected or incorrectly wired opto fork cannot produce a valid calibration.</w:t>
+        <w:t>After the revolution measurement, the motor moves half of the opto opening width forward. This centers the dispenser opening on the opto sensor instead of stopping at the first edge. Measurements that are clearly impossible are rejected, because then the opto fork is probably disconnected or wired incorrectly.</w:t>
       </w:r>
     </w:p>
     <w:p>
@@ -1459,7 +1459,7 @@
         <w:pStyle w:val="Leipteksti"/>
       </w:pPr>
       <w:r>
-        <w:t>Before a compartment movement starts, the program clears the piezo edge counter. The piezo GPIO interrupt then counts falling edges while the motor turns and during a short fall window after the motor stops.</w:t>
+        <w:t>Before a compartment movement starts, the program clears the piezo edge counter. The piezo GPIO interrupt then counts falling edges while the motor turns and for a short time after the motor stops.</w:t>
       </w:r>
     </w:p>
     <w:p>
@@ -1467,7 +1467,7 @@
         <w:pStyle w:val="Leipteksti"/>
       </w:pPr>
       <w:r>
-        <w:t>If at least one piezo falling edge is detected, the dispense is reported as successful. If no edge is detected, the status LED blinks five times. The pill position counter is still decremented after each motor movement because the wheel has physically advanced to the next compartment even if the sensor did not detect a pill.</w:t>
+        <w:t>If at least one piezo falling edge is detected, the dispense is reported as successful. If no edge is detected, the status LED blinks five times. The remaining pill position count is still reduced after the movement, because the wheel has physically moved to the next compartment even if the sensor did not detect a pill.</w:t>
       </w:r>
     </w:p>
     <w:p>
@@ -1483,7 +1483,7 @@
         <w:pStyle w:val="Leipteksti"/>
       </w:pPr>
       <w:r>
-        <w:t>The AT24C256 EEPROM stores the current mode, pills left, measured steps per revolution, whether a motor turn is in progress and a checksum. The EEPROM is used through its two-wire serial interface and page-write limitations are respected according to the datasheet (Atmel Corporation, 2007). The state is saved before a turn starts and after the turn finishes, so the EEPROM is not written on every motor step.</w:t>
+        <w:t>The AT24C256 EEPROM stores the current mode, pills left, measured steps per revolution, whether a motor turn is in progress and a checksum. The EEPROM is used through its two-wire serial interface, and the page-write behaviour follows the datasheet (Atmel Corporation, 2007). The program saves state before a turn starts and after the turn finishes, so it does not write to EEPROM on every motor step.</w:t>
       </w:r>
     </w:p>
     <w:p>
@@ -1491,7 +1491,7 @@
         <w:pStyle w:val="Leipteksti"/>
       </w:pPr>
       <w:r>
-        <w:t>If reset happens while the wheel is moving, the next boot detects the interrupted turn. The recovery routine moves the wheel backwards until the calibration opening is found, centers on that opening, and then moves forward through already emptied positions to return to the last completed position. After that, the interrupted dispense is completed immediately before the normal schedule continues. This avoids saving every motor step to EEPROM while still giving the dose that had already started.</w:t>
+        <w:t>If reset happens while the wheel is moving, the next boot detects the interrupted turn. The recovery routine moves the wheel backwards until the calibration opening is found, centers on that opening, and then moves forward through the already emptied positions. After that, the interrupted dispense is completed immediately before the normal schedule continues. This avoids saving every motor step to EEPROM while still giving the dose that had already started.</w:t>
       </w:r>
     </w:p>
     <w:p>
@@ -1516,7 +1516,7 @@
         <w:pStyle w:val="Leipteksti"/>
       </w:pPr>
       <w:r>
-        <w:t>After joining the network, the application sends short status messages such as boot, calibration_start, calibrated, started, turn_start, dispensed, no_pill and empty. Each status message also includes the number of pill positions left. Motor control continues even if LoRa is unavailable, because dispensing must not depend on network availability.</w:t>
+        <w:t>After joining the network, the application sends short status messages such as boot, calibration_start, calibrated, started, turn_start, dispensed, no_pill and empty. Each message also includes the number of pill positions left. Motor control still continues if LoRa is not available, because the dispenser should not stop only because the network is missing.</w:t>
       </w:r>
     </w:p>
     <w:p>
@@ -1548,7 +1548,7 @@
         <w:pStyle w:val="Leipteksti"/>
       </w:pPr>
       <w:r>
-        <w:t>In CLion, the Run pill_dispenser + Monitor configuration flashes the target through the debug probe and opens the serial monitor. The monitor is useful for checking calibration, LoRa joining, schedule start and dispense events.</w:t>
+        <w:t>In CLion, the Run pill_dispenser + Monitor configuration flashes the target through the debug probe and opens the serial monitor. I used the monitor to check calibration, LoRa joining, schedule start and dispense events.</w:t>
       </w:r>
     </w:p>
     <w:p>
@@ -1556,7 +1556,7 @@
         <w:pStyle w:val="Leipteksti"/>
       </w:pPr>
       <w:r>
-        <w:t>Recommended tests are:</w:t>
+        <w:t>I verified the project with the following checks:</w:t>
       </w:r>
     </w:p>
     <w:p>
@@ -1568,7 +1568,7 @@
         </w:numPr>
       </w:pPr>
       <w:r>
-        <w:t>Build and flash the pill_dispenser target through the debugger.</w:t>
+        <w:t>Built and flashed the pill_dispenser target through the debugger.</w:t>
       </w:r>
     </w:p>
     <w:p>
@@ -1580,7 +1580,7 @@
         </w:numPr>
       </w:pPr>
       <w:r>
-        <w:t>Open the monitor and confirm that the startup text appears.</w:t>
+        <w:t>Opened the monitor and checked that the startup text appeared.</w:t>
       </w:r>
     </w:p>
     <w:p>
@@ -1592,7 +1592,7 @@
         </w:numPr>
       </w:pPr>
       <w:r>
-        <w:t>Press SW0 and confirm that calibration starts and reports measured half steps.</w:t>
+        <w:t>Pressed SW0 and checked that calibration started and reported the measured half steps.</w:t>
       </w:r>
     </w:p>
     <w:p>
@@ -1604,7 +1604,7 @@
         </w:numPr>
       </w:pPr>
       <w:r>
-        <w:t>Check that calibration centers the wheel on the opto opening.</w:t>
+        <w:t>Checked that calibration centered the wheel on the opto opening.</w:t>
       </w:r>
     </w:p>
     <w:p>
@@ -1616,7 +1616,7 @@
         </w:numPr>
       </w:pPr>
       <w:r>
-        <w:t>Press SW0 again and confirm that the 30 second schedule starts.</w:t>
+        <w:t>Pressed SW0 again and checked that the 30 second schedule started.</w:t>
       </w:r>
     </w:p>
     <w:p>
@@ -1628,8 +1628,7 @@
         </w:numPr>
       </w:pPr>
       <w:r>
-        <w:lastRenderedPageBreak/>
-        <w:t>Check that the stepper moves one compartment at every interval.</w:t>
+        <w:t>Checked that the stepper moved one compartment at each interval.</w:t>
       </w:r>
     </w:p>
     <w:p>
@@ -1641,7 +1640,7 @@
         </w:numPr>
       </w:pPr>
       <w:r>
-        <w:t>Test both pill detected and no-pill cases with the piezo sensor.</w:t>
+        <w:t>Tested both pill detected and no-pill cases with the piezo sensor.</w:t>
       </w:r>
     </w:p>
     <w:p>
@@ -1653,7 +1652,7 @@
         </w:numPr>
       </w:pPr>
       <w:r>
-        <w:t>Reset during a motor turn and verify that the wheel reverses to the calibration opening, restores position and completes the interrupted dispense.</w:t>
+        <w:t>Reset the device during motor movement and checked that the recovery logic returned the wheel to the reference position and continued the interrupted dispense.</w:t>
       </w:r>
     </w:p>
     <w:p>
@@ -1665,7 +1664,7 @@
         </w:numPr>
       </w:pPr>
       <w:r>
-        <w:t>Test LoRaWAN status reception in the school network with the provided receiver script.</w:t>
+        <w:t>Tested LoRaWAN status output in the school network with the provided receiver script.</w:t>
       </w:r>
     </w:p>
     <w:p>
@@ -1681,7 +1680,7 @@
         <w:pStyle w:val="Leipteksti"/>
       </w:pPr>
       <w:r>
-        <w:t>Functional testing was carried out with the assembled course board and LoRaWAN coverage available at school. The LoRaWAN part could not be repeated later at home, because joining the network depends on the campus gateway and course network coverage. Therefore, the report separates the classroom observations from the home limitation instead of treating a missing home join as a software failure.</w:t>
+        <w:t>I tested the complete setup with the assembled course board when LoRaWAN coverage was available at school. The LoRaWAN part could not be repeated later at home, because joining the network depends on the campus gateway and course network coverage. For that reason, the home test limitation is not treated as a software problem in this report.</w:t>
       </w:r>
     </w:p>
     <w:p>
@@ -1689,7 +1688,7 @@
         <w:pStyle w:val="Leipteksti"/>
       </w:pPr>
       <w:r>
-        <w:t>The serial monitor confirmed the LoRa-E5 setup sequence. The module answered the basic AT check with LoRa: +AT: OK, accepted OTAA configuration, joined the network and returned join status lines including +JOIN: Network joined and +JOIN: Done. After joining, the program sent short AT+MSG status messages for boot, calibration, schedule start and dispensing events. This verified that the code produces LoRa output through the LoRa-E5 module, while still allowing the dispenser to continue if the network is temporarily unavailable.</w:t>
+        <w:t>In the school test, the serial monitor showed the LoRa-E5 setup sequence. The module answered the basic AT check with LoRa: +AT: OK, accepted OTAA configuration, joined the network and returned join lines including +JOIN: Network joined and +JOIN: Done. After joining, the program sent short AT+MSG status messages for boot, calibration, schedule start and dispensing events. This showed where the LoRa output can be seen and confirmed that the module was used through AT commands.</w:t>
       </w:r>
     </w:p>
     <w:p>
@@ -1697,7 +1696,7 @@
         <w:pStyle w:val="Leipteksti"/>
       </w:pPr>
       <w:r>
-        <w:t>Calibration was tested with SW0. The wheel first searched for the opto fork reference opening, then measured one full revolution. In the working test, the measured value was approximately 4097 half steps per revolution, which gives 512 half steps per compartment for the eight-position dispenser wheel. The final version does not stop at the first opto edge; it moves to the middle of the measured opening so that the dispensing hole is aligned more accurately.</w:t>
+        <w:t>I tested calibration by pressing SW0. The wheel first searched for the opto fork reference opening and then measured one full revolution. In the working test, the measured value was about 4097 half steps per revolution, which gives 512 half steps per compartment for the eight-position wheel. The final version does not stop at the first opto edge. It moves to the middle of the measured opening, which made the dispenser hole line up better.</w:t>
       </w:r>
     </w:p>
     <w:p>
@@ -1705,7 +1704,7 @@
         <w:pStyle w:val="Leipteksti"/>
       </w:pPr>
       <w:r>
-        <w:t>The dispensing schedule was tested after calibration by pressing SW0 again. The monitor showed the schedule start message and then one compartment movement every 30 seconds. During the test without a reliable pill drop on every movement, the no-pill path was also seen with output such as No pill detected, pills left: 6. The program reduced the remaining position count after the mechanical movement, reported the event through LoRa, and used the LED warning behavior for the missing piezo detection. This was useful because it verified both the normal motor path and the sensor-failure path.</w:t>
+        <w:t>After calibration, I pressed SW0 again to start the dispensing schedule. The monitor showed the schedule start message and then one compartment movement every 30 seconds. During the test, a pill drop was not detected on every movement, so the no-pill path was also visible with output such as No pill detected, pills left: 6. The program still reduced the remaining position count after the mechanical movement, sent the event through LoRa and used the LED warning for the missing piezo detection.</w:t>
       </w:r>
     </w:p>
     <w:p>
@@ -1713,7 +1712,7 @@
         <w:pStyle w:val="Leipteksti"/>
       </w:pPr>
       <w:r>
-        <w:t>EEPROM recovery was checked by restarting the device and confirming that the program restored the saved mode and pill count instead of always starting from an empty default state. The code saves turn_in_progress before the motor starts and clears it only after the turn is complete. If power is lost during a movement, the next boot uses this flag to reverse back to the opto reference, return to the last completed position and finish the interrupted dispense immediately. This avoids writing every motor step to EEPROM while still preserving the started dose.</w:t>
+        <w:t>EEPROM recovery was checked by restarting the device and confirming that the program restored the saved mode and pill count instead of always starting from an empty default state. The code saves turn_in_progress before the motor starts and clears it only after the turn is complete. If power is lost during a movement, the next boot uses this flag to reverse back to the opto reference, return to the last completed position and finish the interrupted dispense immediately. This was important because the dispenser should give the dose that had already started, but it still avoids saving every motor step.</w:t>
       </w:r>
     </w:p>
     <w:p>
@@ -1721,7 +1720,7 @@
         <w:pStyle w:val="Leipteksti"/>
       </w:pPr>
       <w:r>
-        <w:t>The main practical observation from testing was mechanical alignment. A small visible offset can occur if the wheel, opto fork and dispenser hole are not physically mounted in exactly the same reference position. The software compensates for this by measuring the opto opening width and moving to its midpoint, but final accuracy still depends on the physical assembly.</w:t>
+        <w:t>The main practical issue I noticed was mechanical alignment. A small visible offset can happen if the wheel, opto fork and dispenser hole are not physically mounted in exactly the same reference position. The software improves this by measuring the opto opening width and moving to its midpoint, but the final accuracy still depends on the physical assembly.</w:t>
       </w:r>
     </w:p>
     <w:p>
@@ -1737,7 +1736,7 @@
         <w:pStyle w:val="Leipteksti"/>
       </w:pPr>
       <w:r>
-        <w:t>The finished project combines the central embedded systems topics from the course: GPIO input and output, interrupts, UART communication, I2C EEPROM access, stepper motor control, non-blocking application flow and persistent recovery state. The code keeps the interrupt handler minimal and places application decisions in normal program flow, which makes the system easier to debug and maintain.</w:t>
+        <w:t>The finished project combines the main embedded systems topics from the course: GPIO input and output, interrupts, UART communication, I2C EEPROM access, stepper motor control, application flow and persistent recovery state. The code keeps the interrupt handler minimal and handles decisions in normal program flow, which made the system easier to debug.</w:t>
       </w:r>
     </w:p>
     <w:p>
@@ -1745,7 +1744,7 @@
         <w:pStyle w:val="Leipteksti"/>
       </w:pPr>
       <w:r>
-        <w:t>The most important functional limitation is mechanical alignment. The software now centers the wheel using the measured opto opening, but a small physical offset may still be needed if the dispenser hole and sensor position are not perfectly aligned in the assembled mechanism.</w:t>
+        <w:t>The biggest remaining limitation is mechanical alignment. The software centers the wheel using the measured opto opening, but a small physical adjustment may still be needed if the dispenser hole and the sensor position are not perfectly aligned in the assembled mechanism.</w:t>
       </w:r>
     </w:p>
     <w:p>

</xml_diff>